<commit_message>
chore: sync generated docx and pdf artifacts
</commit_message>
<xml_diff>
--- a/use-cases/Chozharajan2001/nursing-handoff-assembler/superdocs_handoff_883921.docx
+++ b/use-cases/Chozharajan2001/nursing-handoff-assembler/superdocs_handoff_883921.docx
@@ -771,6 +771,1736 @@
         <w:t>Note: This document is for clinical transfer purposes only and requires verification by the attending physician. Not intended as medical advice.</w:t>
       </w:r>
     </w:p>
+    <w:tbl>
+      <w:tblPr>
+        <w:tblW w:type="dxa" w:w="9360"/>
+        <w:tblLayout w:type="fixed"/>
+        <w:tblLook w:firstColumn="1" w:firstRow="1" w:lastColumn="0" w:lastRow="0" w:noHBand="0" w:noVBand="1" w:val="04A0"/>
+      </w:tblPr>
+      <w:tblGrid>
+        <w:gridCol w:w="4680"/>
+        <w:gridCol w:w="4680"/>
+      </w:tblGrid>
+      <w:tr>
+        <w:tc>
+          <w:tcPr>
+            <w:tcW w:type="dxa" w:w="4680"/>
+            <w:tcBorders>
+              <w:top w:val="single" w:sz="6" w:space="0" w:color="CCCCCC"/>
+              <w:left w:val="single" w:sz="6" w:space="0" w:color="CCCCCC"/>
+              <w:bottom w:val="single" w:sz="6" w:space="0" w:color="CCCCCC"/>
+              <w:right w:val="single" w:sz="6" w:space="0" w:color="CCCCCC"/>
+            </w:tcBorders>
+            <w:shd w:val="clear" w:color="auto" w:fill="F2F2F2"/>
+            <w:tcMar>
+              <w:top w:w="120" w:type="dxa"/>
+              <w:left w:w="120" w:type="dxa"/>
+              <w:bottom w:w="120" w:type="dxa"/>
+              <w:right w:w="120" w:type="dxa"/>
+            </w:tcMar>
+          </w:tcPr>
+          <w:p>
+            <w:r/>
+            <w:r>
+              <w:rPr>
+                <w:b/>
+              </w:rPr>
+              <w:t>Patient Name:</w:t>
+            </w:r>
+            <w:r>
+              <w:rPr/>
+              <w:t xml:space="preserve"> Eleanor Vance</w:t>
+            </w:r>
+          </w:p>
+        </w:tc>
+        <w:tc>
+          <w:tcPr>
+            <w:tcW w:type="dxa" w:w="4680"/>
+            <w:tcBorders>
+              <w:top w:val="single" w:sz="6" w:space="0" w:color="CCCCCC"/>
+              <w:left w:val="single" w:sz="6" w:space="0" w:color="CCCCCC"/>
+              <w:bottom w:val="single" w:sz="6" w:space="0" w:color="CCCCCC"/>
+              <w:right w:val="single" w:sz="6" w:space="0" w:color="CCCCCC"/>
+            </w:tcBorders>
+            <w:shd w:val="clear" w:color="auto" w:fill="F2F2F2"/>
+            <w:tcMar>
+              <w:top w:w="120" w:type="dxa"/>
+              <w:left w:w="120" w:type="dxa"/>
+              <w:bottom w:w="120" w:type="dxa"/>
+              <w:right w:w="120" w:type="dxa"/>
+            </w:tcMar>
+          </w:tcPr>
+          <w:p>
+            <w:r/>
+            <w:r>
+              <w:rPr>
+                <w:b/>
+              </w:rPr>
+              <w:t>MRN:</w:t>
+            </w:r>
+            <w:r>
+              <w:rPr/>
+              <w:t xml:space="preserve"> 883921</w:t>
+            </w:r>
+          </w:p>
+        </w:tc>
+      </w:tr>
+      <w:tr>
+        <w:tc>
+          <w:tcPr>
+            <w:tcW w:type="dxa" w:w="4680"/>
+            <w:tcBorders>
+              <w:top w:val="single" w:sz="6" w:space="0" w:color="CCCCCC"/>
+              <w:left w:val="single" w:sz="6" w:space="0" w:color="CCCCCC"/>
+              <w:bottom w:val="single" w:sz="6" w:space="0" w:color="CCCCCC"/>
+              <w:right w:val="single" w:sz="6" w:space="0" w:color="CCCCCC"/>
+            </w:tcBorders>
+            <w:tcMar>
+              <w:top w:w="120" w:type="dxa"/>
+              <w:left w:w="120" w:type="dxa"/>
+              <w:bottom w:w="120" w:type="dxa"/>
+              <w:right w:w="120" w:type="dxa"/>
+            </w:tcMar>
+          </w:tcPr>
+          <w:p>
+            <w:r/>
+            <w:r>
+              <w:rPr>
+                <w:b/>
+              </w:rPr>
+              <w:t>DOB:</w:t>
+            </w:r>
+            <w:r>
+              <w:rPr/>
+              <w:t xml:space="preserve"> </w:t>
+            </w:r>
+            <w:r>
+              <w:rPr>
+                <w:highlight w:val="yellow"/>
+              </w:rPr>
+              <w:t>Please fill: Date of Birth</w:t>
+            </w:r>
+          </w:p>
+        </w:tc>
+        <w:tc>
+          <w:tcPr>
+            <w:tcW w:type="dxa" w:w="4680"/>
+            <w:tcBorders>
+              <w:top w:val="single" w:sz="6" w:space="0" w:color="CCCCCC"/>
+              <w:left w:val="single" w:sz="6" w:space="0" w:color="CCCCCC"/>
+              <w:bottom w:val="single" w:sz="6" w:space="0" w:color="CCCCCC"/>
+              <w:right w:val="single" w:sz="6" w:space="0" w:color="CCCCCC"/>
+            </w:tcBorders>
+            <w:tcMar>
+              <w:top w:w="120" w:type="dxa"/>
+              <w:left w:w="120" w:type="dxa"/>
+              <w:bottom w:w="120" w:type="dxa"/>
+              <w:right w:w="120" w:type="dxa"/>
+            </w:tcMar>
+          </w:tcPr>
+          <w:p>
+            <w:r/>
+            <w:r>
+              <w:rPr>
+                <w:b/>
+              </w:rPr>
+              <w:t>Date of Transfer:</w:t>
+            </w:r>
+            <w:r>
+              <w:rPr/>
+              <w:t xml:space="preserve"> August 19, 2026</w:t>
+            </w:r>
+          </w:p>
+        </w:tc>
+      </w:tr>
+    </w:tbl>
+    <w:p>
+      <w:pPr>
+        <w:pStyle w:val="Heading2"/>
+      </w:pPr>
+      <w:r>
+        <w:rPr>
+          <w:color w:val="2D5A88"/>
+        </w:rPr>
+        <w:t>Status &amp; Allergies</w:t>
+      </w:r>
+    </w:p>
+    <w:tbl>
+      <w:tblPr>
+        <w:tblW w:type="dxa" w:w="9360"/>
+        <w:tblLayout w:type="fixed"/>
+        <w:tblLook w:firstColumn="1" w:firstRow="1" w:lastColumn="0" w:lastRow="0" w:noHBand="0" w:noVBand="1" w:val="04A0"/>
+      </w:tblPr>
+      <w:tblGrid>
+        <w:gridCol w:w="4680"/>
+        <w:gridCol w:w="4680"/>
+      </w:tblGrid>
+      <w:tr>
+        <w:tc>
+          <w:tcPr>
+            <w:tcW w:type="dxa" w:w="4680"/>
+            <w:tcBorders>
+              <w:top w:val="single" w:sz="6" w:space="0" w:color="CCCCCC"/>
+              <w:left w:val="single" w:sz="6" w:space="0" w:color="CCCCCC"/>
+              <w:bottom w:val="single" w:sz="6" w:space="0" w:color="CCCCCC"/>
+              <w:right w:val="single" w:sz="6" w:space="0" w:color="CCCCCC"/>
+            </w:tcBorders>
+            <w:shd w:val="clear" w:color="auto" w:fill="E0F2F1"/>
+            <w:tcMar>
+              <w:top w:w="120" w:type="dxa"/>
+              <w:left w:w="120" w:type="dxa"/>
+              <w:bottom w:w="120" w:type="dxa"/>
+              <w:right w:w="120" w:type="dxa"/>
+            </w:tcMar>
+          </w:tcPr>
+          <w:p>
+            <w:pPr>
+              <w:jc w:val="left"/>
+            </w:pPr>
+            <w:r/>
+            <w:r>
+              <w:rPr>
+                <w:b/>
+              </w:rPr>
+              <w:t>Parameter</w:t>
+            </w:r>
+          </w:p>
+        </w:tc>
+        <w:tc>
+          <w:tcPr>
+            <w:tcW w:type="dxa" w:w="4680"/>
+            <w:tcBorders>
+              <w:top w:val="single" w:sz="6" w:space="0" w:color="CCCCCC"/>
+              <w:left w:val="single" w:sz="6" w:space="0" w:color="CCCCCC"/>
+              <w:bottom w:val="single" w:sz="6" w:space="0" w:color="CCCCCC"/>
+              <w:right w:val="single" w:sz="6" w:space="0" w:color="CCCCCC"/>
+            </w:tcBorders>
+            <w:shd w:val="clear" w:color="auto" w:fill="E0F2F1"/>
+            <w:tcMar>
+              <w:top w:w="120" w:type="dxa"/>
+              <w:left w:w="120" w:type="dxa"/>
+              <w:bottom w:w="120" w:type="dxa"/>
+              <w:right w:w="120" w:type="dxa"/>
+            </w:tcMar>
+          </w:tcPr>
+          <w:p>
+            <w:pPr>
+              <w:jc w:val="left"/>
+            </w:pPr>
+            <w:r/>
+            <w:r>
+              <w:rPr>
+                <w:b/>
+              </w:rPr>
+              <w:t>Details</w:t>
+            </w:r>
+          </w:p>
+        </w:tc>
+      </w:tr>
+      <w:tr>
+        <w:tc>
+          <w:tcPr>
+            <w:tcW w:type="dxa" w:w="4680"/>
+            <w:tcBorders>
+              <w:top w:val="single" w:sz="6" w:space="0" w:color="CCCCCC"/>
+              <w:left w:val="single" w:sz="6" w:space="0" w:color="CCCCCC"/>
+              <w:bottom w:val="single" w:sz="6" w:space="0" w:color="CCCCCC"/>
+              <w:right w:val="single" w:sz="6" w:space="0" w:color="CCCCCC"/>
+            </w:tcBorders>
+            <w:tcMar>
+              <w:top w:w="120" w:type="dxa"/>
+              <w:left w:w="120" w:type="dxa"/>
+              <w:bottom w:w="120" w:type="dxa"/>
+              <w:right w:w="120" w:type="dxa"/>
+            </w:tcMar>
+          </w:tcPr>
+          <w:p>
+            <w:r/>
+            <w:r>
+              <w:rPr>
+                <w:b/>
+              </w:rPr>
+              <w:t>Code Status</w:t>
+            </w:r>
+          </w:p>
+        </w:tc>
+        <w:tc>
+          <w:tcPr>
+            <w:tcW w:type="dxa" w:w="4680"/>
+            <w:tcBorders>
+              <w:top w:val="single" w:sz="6" w:space="0" w:color="CCCCCC"/>
+              <w:left w:val="single" w:sz="6" w:space="0" w:color="CCCCCC"/>
+              <w:bottom w:val="single" w:sz="6" w:space="0" w:color="CCCCCC"/>
+              <w:right w:val="single" w:sz="6" w:space="0" w:color="CCCCCC"/>
+            </w:tcBorders>
+            <w:tcMar>
+              <w:top w:w="120" w:type="dxa"/>
+              <w:left w:w="120" w:type="dxa"/>
+              <w:bottom w:w="120" w:type="dxa"/>
+              <w:right w:w="120" w:type="dxa"/>
+            </w:tcMar>
+          </w:tcPr>
+          <w:p>
+            <w:r/>
+            <w:r>
+              <w:rPr/>
+              <w:t>FULL CODE</w:t>
+            </w:r>
+          </w:p>
+        </w:tc>
+      </w:tr>
+      <w:tr>
+        <w:tc>
+          <w:tcPr>
+            <w:tcW w:type="dxa" w:w="4680"/>
+            <w:tcBorders>
+              <w:top w:val="single" w:sz="6" w:space="0" w:color="CCCCCC"/>
+              <w:left w:val="single" w:sz="6" w:space="0" w:color="CCCCCC"/>
+              <w:bottom w:val="single" w:sz="6" w:space="0" w:color="CCCCCC"/>
+              <w:right w:val="single" w:sz="6" w:space="0" w:color="CCCCCC"/>
+            </w:tcBorders>
+            <w:tcMar>
+              <w:top w:w="120" w:type="dxa"/>
+              <w:left w:w="120" w:type="dxa"/>
+              <w:bottom w:w="120" w:type="dxa"/>
+              <w:right w:w="120" w:type="dxa"/>
+            </w:tcMar>
+          </w:tcPr>
+          <w:p>
+            <w:r/>
+            <w:r>
+              <w:rPr>
+                <w:b/>
+              </w:rPr>
+              <w:t>Allergies</w:t>
+            </w:r>
+          </w:p>
+        </w:tc>
+        <w:tc>
+          <w:tcPr>
+            <w:tcW w:type="dxa" w:w="4680"/>
+            <w:tcBorders>
+              <w:top w:val="single" w:sz="6" w:space="0" w:color="CCCCCC"/>
+              <w:left w:val="single" w:sz="6" w:space="0" w:color="CCCCCC"/>
+              <w:bottom w:val="single" w:sz="6" w:space="0" w:color="CCCCCC"/>
+              <w:right w:val="single" w:sz="6" w:space="0" w:color="CCCCCC"/>
+            </w:tcBorders>
+            <w:tcMar>
+              <w:top w:w="120" w:type="dxa"/>
+              <w:left w:w="120" w:type="dxa"/>
+              <w:bottom w:w="120" w:type="dxa"/>
+              <w:right w:w="120" w:type="dxa"/>
+            </w:tcMar>
+          </w:tcPr>
+          <w:p>
+            <w:r/>
+            <w:r>
+              <w:rPr/>
+              <w:t>Penicillin (Anaphylaxis), Sulfa drugs (Hives)</w:t>
+            </w:r>
+          </w:p>
+        </w:tc>
+      </w:tr>
+    </w:tbl>
+    <w:tbl>
+      <w:tblPr>
+        <w:tblW w:type="dxa" w:w="9360"/>
+        <w:tblLayout w:type="fixed"/>
+        <w:tblLook w:firstColumn="1" w:firstRow="1" w:lastColumn="0" w:lastRow="0" w:noHBand="0" w:noVBand="1" w:val="04A0"/>
+      </w:tblPr>
+      <w:tblGrid>
+        <w:gridCol w:w="9360"/>
+      </w:tblGrid>
+      <w:tr>
+        <w:tc>
+          <w:tcPr>
+            <w:tcW w:type="dxa" w:w="9360"/>
+            <w:tcBorders>
+              <w:top w:val="single" w:sz="6" w:space="0" w:color="CCCCCC"/>
+              <w:left w:val="single" w:sz="6" w:space="0" w:color="CCCCCC"/>
+              <w:bottom w:val="single" w:sz="6" w:space="0" w:color="CCCCCC"/>
+              <w:right w:val="single" w:sz="6" w:space="0" w:color="CCCCCC"/>
+            </w:tcBorders>
+            <w:shd w:val="clear" w:color="auto" w:fill="E0F2F1"/>
+            <w:tcMar>
+              <w:top w:w="120" w:type="dxa"/>
+              <w:left w:w="120" w:type="dxa"/>
+              <w:bottom w:w="120" w:type="dxa"/>
+              <w:right w:w="120" w:type="dxa"/>
+            </w:tcMar>
+          </w:tcPr>
+          <w:p>
+            <w:pPr>
+              <w:jc w:val="left"/>
+            </w:pPr>
+            <w:r/>
+            <w:r>
+              <w:rPr>
+                <w:b/>
+              </w:rPr>
+              <w:t>Reconciled MAR</w:t>
+            </w:r>
+          </w:p>
+        </w:tc>
+      </w:tr>
+      <w:tr>
+        <w:tc>
+          <w:tcPr>
+            <w:tcW w:type="dxa" w:w="9360"/>
+            <w:tcBorders>
+              <w:top w:val="single" w:sz="6" w:space="0" w:color="CCCCCC"/>
+              <w:left w:val="single" w:sz="6" w:space="0" w:color="CCCCCC"/>
+              <w:bottom w:val="single" w:sz="6" w:space="0" w:color="CCCCCC"/>
+              <w:right w:val="single" w:sz="6" w:space="0" w:color="CCCCCC"/>
+            </w:tcBorders>
+            <w:tcMar>
+              <w:top w:w="120" w:type="dxa"/>
+              <w:left w:w="120" w:type="dxa"/>
+              <w:bottom w:w="120" w:type="dxa"/>
+              <w:right w:w="120" w:type="dxa"/>
+            </w:tcMar>
+          </w:tcPr>
+          <w:p>
+            <w:r/>
+            <w:r>
+              <w:rPr/>
+              <w:t>Lisinopril 10 mg PO Daily</w:t>
+            </w:r>
+          </w:p>
+        </w:tc>
+      </w:tr>
+      <w:tr>
+        <w:tc>
+          <w:tcPr>
+            <w:tcW w:type="dxa" w:w="9360"/>
+            <w:tcBorders>
+              <w:top w:val="single" w:sz="6" w:space="0" w:color="CCCCCC"/>
+              <w:left w:val="single" w:sz="6" w:space="0" w:color="CCCCCC"/>
+              <w:bottom w:val="single" w:sz="6" w:space="0" w:color="CCCCCC"/>
+              <w:right w:val="single" w:sz="6" w:space="0" w:color="CCCCCC"/>
+            </w:tcBorders>
+            <w:tcMar>
+              <w:top w:w="120" w:type="dxa"/>
+              <w:left w:w="120" w:type="dxa"/>
+              <w:bottom w:w="120" w:type="dxa"/>
+              <w:right w:w="120" w:type="dxa"/>
+            </w:tcMar>
+          </w:tcPr>
+          <w:p>
+            <w:r/>
+            <w:r>
+              <w:rPr/>
+              <w:t>Metformin 500 mg PO BID</w:t>
+            </w:r>
+          </w:p>
+        </w:tc>
+      </w:tr>
+      <w:tr>
+        <w:tc>
+          <w:tcPr>
+            <w:tcW w:type="dxa" w:w="9360"/>
+            <w:tcBorders>
+              <w:top w:val="single" w:sz="6" w:space="0" w:color="CCCCCC"/>
+              <w:left w:val="single" w:sz="6" w:space="0" w:color="CCCCCC"/>
+              <w:bottom w:val="single" w:sz="6" w:space="0" w:color="CCCCCC"/>
+              <w:right w:val="single" w:sz="6" w:space="0" w:color="CCCCCC"/>
+            </w:tcBorders>
+            <w:tcMar>
+              <w:top w:w="120" w:type="dxa"/>
+              <w:left w:w="120" w:type="dxa"/>
+              <w:bottom w:w="120" w:type="dxa"/>
+              <w:right w:w="120" w:type="dxa"/>
+            </w:tcMar>
+          </w:tcPr>
+          <w:p>
+            <w:r/>
+            <w:r>
+              <w:rPr/>
+              <w:t>Atorvastatin 20 mg PO Daily at bedtime</w:t>
+            </w:r>
+          </w:p>
+        </w:tc>
+      </w:tr>
+      <w:tr>
+        <w:tc>
+          <w:tcPr>
+            <w:tcW w:type="dxa" w:w="9360"/>
+            <w:tcBorders>
+              <w:top w:val="single" w:sz="6" w:space="0" w:color="CCCCCC"/>
+              <w:left w:val="single" w:sz="6" w:space="0" w:color="CCCCCC"/>
+              <w:bottom w:val="single" w:sz="6" w:space="0" w:color="CCCCCC"/>
+              <w:right w:val="single" w:sz="6" w:space="0" w:color="CCCCCC"/>
+            </w:tcBorders>
+            <w:tcMar>
+              <w:top w:w="120" w:type="dxa"/>
+              <w:left w:w="120" w:type="dxa"/>
+              <w:bottom w:w="120" w:type="dxa"/>
+              <w:right w:w="120" w:type="dxa"/>
+            </w:tcMar>
+          </w:tcPr>
+          <w:p>
+            <w:r/>
+            <w:r>
+              <w:rPr/>
+              <w:t>Omeprazole 20 mg PO Daily</w:t>
+            </w:r>
+          </w:p>
+        </w:tc>
+      </w:tr>
+    </w:tbl>
+    <w:p>
+      <w:pPr>
+        <w:pStyle w:val="Heading2"/>
+      </w:pPr>
+      <w:r>
+        <w:rPr>
+          <w:color w:val="2D5A88"/>
+        </w:rPr>
+        <w:t>Reconciled MAR</w:t>
+      </w:r>
+    </w:p>
+    <w:p>
+      <w:pPr>
+        <w:pStyle w:val="Heading2"/>
+      </w:pPr>
+      <w:r>
+        <w:rPr/>
+        <w:t>Reconciled MAR</w:t>
+      </w:r>
+    </w:p>
+    <w:tbl>
+      <w:tblPr>
+        <w:tblW w:type="dxa" w:w="9360"/>
+        <w:tblLayout w:type="fixed"/>
+        <w:tblLook w:firstColumn="1" w:firstRow="1" w:lastColumn="0" w:lastRow="0" w:noHBand="0" w:noVBand="1" w:val="04A0"/>
+      </w:tblPr>
+      <w:tblGrid>
+        <w:gridCol w:w="3120"/>
+        <w:gridCol w:w="3120"/>
+        <w:gridCol w:w="3120"/>
+      </w:tblGrid>
+      <w:tr>
+        <w:tc>
+          <w:tcPr>
+            <w:tcW w:type="dxa" w:w="3120"/>
+            <w:tcBorders>
+              <w:top w:val="single" w:sz="6" w:space="0" w:color="D0D7DE"/>
+              <w:left w:val="single" w:sz="6" w:space="0" w:color="D0D7DE"/>
+              <w:bottom w:val="single" w:sz="6" w:space="0" w:color="D0D7DE"/>
+              <w:right w:val="single" w:sz="6" w:space="0" w:color="D0D7DE"/>
+            </w:tcBorders>
+            <w:shd w:val="clear" w:color="auto" w:fill="F0F4F8"/>
+            <w:tcMar>
+              <w:top w:w="120" w:type="dxa"/>
+              <w:left w:w="120" w:type="dxa"/>
+              <w:bottom w:w="120" w:type="dxa"/>
+              <w:right w:w="120" w:type="dxa"/>
+            </w:tcMar>
+          </w:tcPr>
+          <w:p>
+            <w:pPr>
+              <w:jc w:val="left"/>
+            </w:pPr>
+            <w:r/>
+            <w:r>
+              <w:rPr>
+                <w:b/>
+              </w:rPr>
+              <w:t>Medication</w:t>
+            </w:r>
+          </w:p>
+        </w:tc>
+        <w:tc>
+          <w:tcPr>
+            <w:tcW w:type="dxa" w:w="3120"/>
+            <w:tcBorders>
+              <w:top w:val="single" w:sz="6" w:space="0" w:color="D0D7DE"/>
+              <w:left w:val="single" w:sz="6" w:space="0" w:color="D0D7DE"/>
+              <w:bottom w:val="single" w:sz="6" w:space="0" w:color="D0D7DE"/>
+              <w:right w:val="single" w:sz="6" w:space="0" w:color="D0D7DE"/>
+            </w:tcBorders>
+            <w:shd w:val="clear" w:color="auto" w:fill="F0F4F8"/>
+            <w:tcMar>
+              <w:top w:w="120" w:type="dxa"/>
+              <w:left w:w="120" w:type="dxa"/>
+              <w:bottom w:w="120" w:type="dxa"/>
+              <w:right w:w="120" w:type="dxa"/>
+            </w:tcMar>
+          </w:tcPr>
+          <w:p>
+            <w:pPr>
+              <w:jc w:val="left"/>
+            </w:pPr>
+            <w:r/>
+            <w:r>
+              <w:rPr>
+                <w:b/>
+              </w:rPr>
+              <w:t>Dose/Route</w:t>
+            </w:r>
+          </w:p>
+        </w:tc>
+        <w:tc>
+          <w:tcPr>
+            <w:tcW w:type="dxa" w:w="3120"/>
+            <w:tcBorders>
+              <w:top w:val="single" w:sz="6" w:space="0" w:color="D0D7DE"/>
+              <w:left w:val="single" w:sz="6" w:space="0" w:color="D0D7DE"/>
+              <w:bottom w:val="single" w:sz="6" w:space="0" w:color="D0D7DE"/>
+              <w:right w:val="single" w:sz="6" w:space="0" w:color="D0D7DE"/>
+            </w:tcBorders>
+            <w:shd w:val="clear" w:color="auto" w:fill="F0F4F8"/>
+            <w:tcMar>
+              <w:top w:w="120" w:type="dxa"/>
+              <w:left w:w="120" w:type="dxa"/>
+              <w:bottom w:w="120" w:type="dxa"/>
+              <w:right w:w="120" w:type="dxa"/>
+            </w:tcMar>
+          </w:tcPr>
+          <w:p>
+            <w:pPr>
+              <w:jc w:val="left"/>
+            </w:pPr>
+            <w:r/>
+            <w:r>
+              <w:rPr>
+                <w:b/>
+              </w:rPr>
+              <w:t>Frequency</w:t>
+            </w:r>
+          </w:p>
+        </w:tc>
+      </w:tr>
+      <w:tr>
+        <w:tc>
+          <w:tcPr>
+            <w:tcW w:type="dxa" w:w="3120"/>
+            <w:tcBorders>
+              <w:top w:val="single" w:sz="6" w:space="0" w:color="D0D7DE"/>
+              <w:left w:val="single" w:sz="6" w:space="0" w:color="D0D7DE"/>
+              <w:bottom w:val="single" w:sz="6" w:space="0" w:color="D0D7DE"/>
+              <w:right w:val="single" w:sz="6" w:space="0" w:color="D0D7DE"/>
+            </w:tcBorders>
+            <w:tcMar>
+              <w:top w:w="120" w:type="dxa"/>
+              <w:left w:w="120" w:type="dxa"/>
+              <w:bottom w:w="120" w:type="dxa"/>
+              <w:right w:w="120" w:type="dxa"/>
+            </w:tcMar>
+          </w:tcPr>
+          <w:p>
+            <w:r/>
+            <w:r>
+              <w:rPr/>
+              <w:t>Lisinopril</w:t>
+            </w:r>
+          </w:p>
+        </w:tc>
+        <w:tc>
+          <w:tcPr>
+            <w:tcW w:type="dxa" w:w="3120"/>
+            <w:tcBorders>
+              <w:top w:val="single" w:sz="6" w:space="0" w:color="D0D7DE"/>
+              <w:left w:val="single" w:sz="6" w:space="0" w:color="D0D7DE"/>
+              <w:bottom w:val="single" w:sz="6" w:space="0" w:color="D0D7DE"/>
+              <w:right w:val="single" w:sz="6" w:space="0" w:color="D0D7DE"/>
+            </w:tcBorders>
+            <w:tcMar>
+              <w:top w:w="120" w:type="dxa"/>
+              <w:left w:w="120" w:type="dxa"/>
+              <w:bottom w:w="120" w:type="dxa"/>
+              <w:right w:w="120" w:type="dxa"/>
+            </w:tcMar>
+          </w:tcPr>
+          <w:p>
+            <w:r/>
+            <w:r>
+              <w:rPr/>
+              <w:t>10 mg PO</w:t>
+            </w:r>
+          </w:p>
+        </w:tc>
+        <w:tc>
+          <w:tcPr>
+            <w:tcW w:type="dxa" w:w="3120"/>
+            <w:tcBorders>
+              <w:top w:val="single" w:sz="6" w:space="0" w:color="D0D7DE"/>
+              <w:left w:val="single" w:sz="6" w:space="0" w:color="D0D7DE"/>
+              <w:bottom w:val="single" w:sz="6" w:space="0" w:color="D0D7DE"/>
+              <w:right w:val="single" w:sz="6" w:space="0" w:color="D0D7DE"/>
+            </w:tcBorders>
+            <w:tcMar>
+              <w:top w:w="120" w:type="dxa"/>
+              <w:left w:w="120" w:type="dxa"/>
+              <w:bottom w:w="120" w:type="dxa"/>
+              <w:right w:w="120" w:type="dxa"/>
+            </w:tcMar>
+          </w:tcPr>
+          <w:p>
+            <w:r/>
+            <w:r>
+              <w:rPr/>
+              <w:t>Daily</w:t>
+            </w:r>
+          </w:p>
+        </w:tc>
+      </w:tr>
+      <w:tr>
+        <w:tc>
+          <w:tcPr>
+            <w:tcW w:type="dxa" w:w="3120"/>
+            <w:tcBorders>
+              <w:top w:val="single" w:sz="6" w:space="0" w:color="D0D7DE"/>
+              <w:left w:val="single" w:sz="6" w:space="0" w:color="D0D7DE"/>
+              <w:bottom w:val="single" w:sz="6" w:space="0" w:color="D0D7DE"/>
+              <w:right w:val="single" w:sz="6" w:space="0" w:color="D0D7DE"/>
+            </w:tcBorders>
+            <w:tcMar>
+              <w:top w:w="120" w:type="dxa"/>
+              <w:left w:w="120" w:type="dxa"/>
+              <w:bottom w:w="120" w:type="dxa"/>
+              <w:right w:w="120" w:type="dxa"/>
+            </w:tcMar>
+          </w:tcPr>
+          <w:p>
+            <w:r/>
+            <w:r>
+              <w:rPr/>
+              <w:t>Metformin</w:t>
+            </w:r>
+          </w:p>
+        </w:tc>
+        <w:tc>
+          <w:tcPr>
+            <w:tcW w:type="dxa" w:w="3120"/>
+            <w:tcBorders>
+              <w:top w:val="single" w:sz="6" w:space="0" w:color="D0D7DE"/>
+              <w:left w:val="single" w:sz="6" w:space="0" w:color="D0D7DE"/>
+              <w:bottom w:val="single" w:sz="6" w:space="0" w:color="D0D7DE"/>
+              <w:right w:val="single" w:sz="6" w:space="0" w:color="D0D7DE"/>
+            </w:tcBorders>
+            <w:tcMar>
+              <w:top w:w="120" w:type="dxa"/>
+              <w:left w:w="120" w:type="dxa"/>
+              <w:bottom w:w="120" w:type="dxa"/>
+              <w:right w:w="120" w:type="dxa"/>
+            </w:tcMar>
+          </w:tcPr>
+          <w:p>
+            <w:r/>
+            <w:r>
+              <w:rPr/>
+              <w:t>500 mg PO</w:t>
+            </w:r>
+          </w:p>
+        </w:tc>
+        <w:tc>
+          <w:tcPr>
+            <w:tcW w:type="dxa" w:w="3120"/>
+            <w:tcBorders>
+              <w:top w:val="single" w:sz="6" w:space="0" w:color="D0D7DE"/>
+              <w:left w:val="single" w:sz="6" w:space="0" w:color="D0D7DE"/>
+              <w:bottom w:val="single" w:sz="6" w:space="0" w:color="D0D7DE"/>
+              <w:right w:val="single" w:sz="6" w:space="0" w:color="D0D7DE"/>
+            </w:tcBorders>
+            <w:tcMar>
+              <w:top w:w="120" w:type="dxa"/>
+              <w:left w:w="120" w:type="dxa"/>
+              <w:bottom w:w="120" w:type="dxa"/>
+              <w:right w:w="120" w:type="dxa"/>
+            </w:tcMar>
+          </w:tcPr>
+          <w:p>
+            <w:r/>
+            <w:r>
+              <w:rPr/>
+              <w:t>BID</w:t>
+            </w:r>
+          </w:p>
+        </w:tc>
+      </w:tr>
+      <w:tr>
+        <w:tc>
+          <w:tcPr>
+            <w:tcW w:type="dxa" w:w="3120"/>
+            <w:tcBorders>
+              <w:top w:val="single" w:sz="6" w:space="0" w:color="D0D7DE"/>
+              <w:left w:val="single" w:sz="6" w:space="0" w:color="D0D7DE"/>
+              <w:bottom w:val="single" w:sz="6" w:space="0" w:color="D0D7DE"/>
+              <w:right w:val="single" w:sz="6" w:space="0" w:color="D0D7DE"/>
+            </w:tcBorders>
+            <w:tcMar>
+              <w:top w:w="120" w:type="dxa"/>
+              <w:left w:w="120" w:type="dxa"/>
+              <w:bottom w:w="120" w:type="dxa"/>
+              <w:right w:w="120" w:type="dxa"/>
+            </w:tcMar>
+          </w:tcPr>
+          <w:p>
+            <w:r/>
+            <w:r>
+              <w:rPr/>
+              <w:t>Atorvastatin</w:t>
+            </w:r>
+          </w:p>
+        </w:tc>
+        <w:tc>
+          <w:tcPr>
+            <w:tcW w:type="dxa" w:w="3120"/>
+            <w:tcBorders>
+              <w:top w:val="single" w:sz="6" w:space="0" w:color="D0D7DE"/>
+              <w:left w:val="single" w:sz="6" w:space="0" w:color="D0D7DE"/>
+              <w:bottom w:val="single" w:sz="6" w:space="0" w:color="D0D7DE"/>
+              <w:right w:val="single" w:sz="6" w:space="0" w:color="D0D7DE"/>
+            </w:tcBorders>
+            <w:tcMar>
+              <w:top w:w="120" w:type="dxa"/>
+              <w:left w:w="120" w:type="dxa"/>
+              <w:bottom w:w="120" w:type="dxa"/>
+              <w:right w:w="120" w:type="dxa"/>
+            </w:tcMar>
+          </w:tcPr>
+          <w:p>
+            <w:r/>
+            <w:r>
+              <w:rPr/>
+              <w:t>20 mg PO</w:t>
+            </w:r>
+          </w:p>
+        </w:tc>
+        <w:tc>
+          <w:tcPr>
+            <w:tcW w:type="dxa" w:w="3120"/>
+            <w:tcBorders>
+              <w:top w:val="single" w:sz="6" w:space="0" w:color="D0D7DE"/>
+              <w:left w:val="single" w:sz="6" w:space="0" w:color="D0D7DE"/>
+              <w:bottom w:val="single" w:sz="6" w:space="0" w:color="D0D7DE"/>
+              <w:right w:val="single" w:sz="6" w:space="0" w:color="D0D7DE"/>
+            </w:tcBorders>
+            <w:tcMar>
+              <w:top w:w="120" w:type="dxa"/>
+              <w:left w:w="120" w:type="dxa"/>
+              <w:bottom w:w="120" w:type="dxa"/>
+              <w:right w:w="120" w:type="dxa"/>
+            </w:tcMar>
+          </w:tcPr>
+          <w:p>
+            <w:r/>
+            <w:r>
+              <w:rPr/>
+              <w:t>Daily at bedtime</w:t>
+            </w:r>
+          </w:p>
+        </w:tc>
+      </w:tr>
+      <w:tr>
+        <w:tc>
+          <w:tcPr>
+            <w:tcW w:type="dxa" w:w="3120"/>
+            <w:tcBorders>
+              <w:top w:val="single" w:sz="6" w:space="0" w:color="D0D7DE"/>
+              <w:left w:val="single" w:sz="6" w:space="0" w:color="D0D7DE"/>
+              <w:bottom w:val="single" w:sz="6" w:space="0" w:color="D0D7DE"/>
+              <w:right w:val="single" w:sz="6" w:space="0" w:color="D0D7DE"/>
+            </w:tcBorders>
+            <w:tcMar>
+              <w:top w:w="120" w:type="dxa"/>
+              <w:left w:w="120" w:type="dxa"/>
+              <w:bottom w:w="120" w:type="dxa"/>
+              <w:right w:w="120" w:type="dxa"/>
+            </w:tcMar>
+          </w:tcPr>
+          <w:p>
+            <w:r/>
+            <w:r>
+              <w:rPr/>
+              <w:t>Omeprazole</w:t>
+            </w:r>
+          </w:p>
+        </w:tc>
+        <w:tc>
+          <w:tcPr>
+            <w:tcW w:type="dxa" w:w="3120"/>
+            <w:tcBorders>
+              <w:top w:val="single" w:sz="6" w:space="0" w:color="D0D7DE"/>
+              <w:left w:val="single" w:sz="6" w:space="0" w:color="D0D7DE"/>
+              <w:bottom w:val="single" w:sz="6" w:space="0" w:color="D0D7DE"/>
+              <w:right w:val="single" w:sz="6" w:space="0" w:color="D0D7DE"/>
+            </w:tcBorders>
+            <w:tcMar>
+              <w:top w:w="120" w:type="dxa"/>
+              <w:left w:w="120" w:type="dxa"/>
+              <w:bottom w:w="120" w:type="dxa"/>
+              <w:right w:w="120" w:type="dxa"/>
+            </w:tcMar>
+          </w:tcPr>
+          <w:p>
+            <w:r/>
+            <w:r>
+              <w:rPr/>
+              <w:t>20 mg PO</w:t>
+            </w:r>
+          </w:p>
+        </w:tc>
+        <w:tc>
+          <w:tcPr>
+            <w:tcW w:type="dxa" w:w="3120"/>
+            <w:tcBorders>
+              <w:top w:val="single" w:sz="6" w:space="0" w:color="D0D7DE"/>
+              <w:left w:val="single" w:sz="6" w:space="0" w:color="D0D7DE"/>
+              <w:bottom w:val="single" w:sz="6" w:space="0" w:color="D0D7DE"/>
+              <w:right w:val="single" w:sz="6" w:space="0" w:color="D0D7DE"/>
+            </w:tcBorders>
+            <w:tcMar>
+              <w:top w:w="120" w:type="dxa"/>
+              <w:left w:w="120" w:type="dxa"/>
+              <w:bottom w:w="120" w:type="dxa"/>
+              <w:right w:w="120" w:type="dxa"/>
+            </w:tcMar>
+          </w:tcPr>
+          <w:p>
+            <w:r/>
+            <w:r>
+              <w:rPr/>
+              <w:t>Daily</w:t>
+            </w:r>
+          </w:p>
+        </w:tc>
+      </w:tr>
+    </w:tbl>
+    <w:p>
+      <w:r>
+        <w:rPr>
+          <w:b/>
+        </w:rPr>
+        <w:t>Status &amp; Allergies</w:t>
+      </w:r>
+    </w:p>
+    <w:p>
+      <w:r>
+        <w:rPr/>
+        <w:t>Allergies: Penicillin (Anaphylaxis), Sulfa drugs (Hives)</w:t>
+      </w:r>
+      <w:r>
+        <w:br/>
+      </w:r>
+      <w:r>
+        <w:rPr/>
+        <w:t>Code Status: FULL CODE</w:t>
+      </w:r>
+    </w:p>
+    <w:p>
+      <w:pPr>
+        <w:spacing w:before="300"/>
+      </w:pPr>
+      <w:r>
+        <w:rPr>
+          <w:i/>
+          <w:color w:val="555555"/>
+          <w:sz w:val="21"/>
+        </w:rPr>
+        <w:t>Note: This document is for clinical transfer purposes only and requires verification by the attending physician. Not intended as medical advice.</w:t>
+      </w:r>
+    </w:p>
+    <w:p>
+      <w:pPr>
+        <w:pStyle w:val="Heading1"/>
+      </w:pPr>
+      <w:r>
+        <w:rPr/>
+        <w:t>Clinical Transfer Summary</w:t>
+      </w:r>
+    </w:p>
+    <w:p>
+      <w:r>
+        <w:rPr>
+          <w:b/>
+        </w:rPr>
+        <w:t>Patient Name:</w:t>
+      </w:r>
+      <w:r>
+        <w:rPr/>
+        <w:t xml:space="preserve"> Eleanor Vance</w:t>
+      </w:r>
+      <w:r>
+        <w:br/>
+      </w:r>
+      <w:r>
+        <w:rPr>
+          <w:b/>
+        </w:rPr>
+        <w:t>MRN:</w:t>
+      </w:r>
+      <w:r>
+        <w:rPr/>
+        <w:t xml:space="preserve"> 883921</w:t>
+      </w:r>
+      <w:r>
+        <w:br/>
+      </w:r>
+      <w:r>
+        <w:rPr>
+          <w:b/>
+        </w:rPr>
+        <w:t>Date of Transfer:</w:t>
+      </w:r>
+      <w:r>
+        <w:rPr/>
+        <w:t xml:space="preserve"> August 19, 2026</w:t>
+      </w:r>
+    </w:p>
+    <w:p>
+      <w:pPr>
+        <w:pStyle w:val="Heading2"/>
+      </w:pPr>
+      <w:r>
+        <w:rPr>
+          <w:color w:val="1F3A5F"/>
+        </w:rPr>
+        <w:t>Status &amp; Allergies</w:t>
+      </w:r>
+    </w:p>
+    <w:p>
+      <w:r>
+        <w:rPr>
+          <w:b/>
+        </w:rPr>
+        <w:t>Status &amp; Allergies:</w:t>
+      </w:r>
+      <w:r>
+        <w:rPr/>
+        <w:t xml:space="preserve"> Allergies: Penicillin (Anaphylaxis), Sulfa drugs (Hives); Code Status: FULL CODE</w:t>
+      </w:r>
+    </w:p>
+    <w:p>
+      <w:r>
+        <w:rPr>
+          <w:b/>
+        </w:rPr>
+        <w:t>Reconciled MAR:</w:t>
+      </w:r>
+    </w:p>
+    <w:tbl>
+      <w:tblPr>
+        <w:tblW w:type="dxa" w:w="9360"/>
+        <w:tblLayout w:type="fixed"/>
+        <w:tblLook w:firstColumn="1" w:firstRow="1" w:lastColumn="0" w:lastRow="0" w:noHBand="0" w:noVBand="1" w:val="04A0"/>
+      </w:tblPr>
+      <w:tblGrid>
+        <w:gridCol w:w="2340"/>
+        <w:gridCol w:w="2340"/>
+        <w:gridCol w:w="2340"/>
+        <w:gridCol w:w="2340"/>
+      </w:tblGrid>
+      <w:tr>
+        <w:tc>
+          <w:tcPr>
+            <w:tcW w:type="dxa" w:w="2340"/>
+          </w:tcPr>
+          <w:p>
+            <w:r/>
+            <w:r>
+              <w:rPr>
+                <w:b/>
+              </w:rPr>
+              <w:t>Medication</w:t>
+            </w:r>
+          </w:p>
+        </w:tc>
+        <w:tc>
+          <w:tcPr>
+            <w:tcW w:type="dxa" w:w="2340"/>
+          </w:tcPr>
+          <w:p>
+            <w:r/>
+            <w:r>
+              <w:rPr>
+                <w:b/>
+              </w:rPr>
+              <w:t>Dosage</w:t>
+            </w:r>
+          </w:p>
+        </w:tc>
+        <w:tc>
+          <w:tcPr>
+            <w:tcW w:type="dxa" w:w="2340"/>
+          </w:tcPr>
+          <w:p>
+            <w:r/>
+            <w:r>
+              <w:rPr>
+                <w:b/>
+              </w:rPr>
+              <w:t>Route</w:t>
+            </w:r>
+          </w:p>
+        </w:tc>
+        <w:tc>
+          <w:tcPr>
+            <w:tcW w:type="dxa" w:w="2340"/>
+          </w:tcPr>
+          <w:p>
+            <w:r/>
+            <w:r>
+              <w:rPr>
+                <w:b/>
+              </w:rPr>
+              <w:t>Frequency</w:t>
+            </w:r>
+          </w:p>
+        </w:tc>
+      </w:tr>
+      <w:tr>
+        <w:tc>
+          <w:tcPr>
+            <w:tcW w:type="dxa" w:w="2340"/>
+          </w:tcPr>
+          <w:p>
+            <w:r/>
+            <w:r>
+              <w:rPr/>
+              <w:t>Lisinopril</w:t>
+            </w:r>
+          </w:p>
+        </w:tc>
+        <w:tc>
+          <w:tcPr>
+            <w:tcW w:type="dxa" w:w="2340"/>
+          </w:tcPr>
+          <w:p>
+            <w:r/>
+            <w:r>
+              <w:rPr/>
+              <w:t>10 mg</w:t>
+            </w:r>
+          </w:p>
+        </w:tc>
+        <w:tc>
+          <w:tcPr>
+            <w:tcW w:type="dxa" w:w="2340"/>
+          </w:tcPr>
+          <w:p>
+            <w:r/>
+            <w:r>
+              <w:rPr/>
+              <w:t>PO</w:t>
+            </w:r>
+          </w:p>
+        </w:tc>
+        <w:tc>
+          <w:tcPr>
+            <w:tcW w:type="dxa" w:w="2340"/>
+          </w:tcPr>
+          <w:p>
+            <w:r/>
+            <w:r>
+              <w:rPr/>
+              <w:t>Daily</w:t>
+            </w:r>
+          </w:p>
+        </w:tc>
+      </w:tr>
+      <w:tr>
+        <w:tc>
+          <w:tcPr>
+            <w:tcW w:type="dxa" w:w="2340"/>
+          </w:tcPr>
+          <w:p>
+            <w:r/>
+            <w:r>
+              <w:rPr/>
+              <w:t>Metformin</w:t>
+            </w:r>
+          </w:p>
+        </w:tc>
+        <w:tc>
+          <w:tcPr>
+            <w:tcW w:type="dxa" w:w="2340"/>
+          </w:tcPr>
+          <w:p>
+            <w:r/>
+            <w:r>
+              <w:rPr/>
+              <w:t>500 mg</w:t>
+            </w:r>
+          </w:p>
+        </w:tc>
+        <w:tc>
+          <w:tcPr>
+            <w:tcW w:type="dxa" w:w="2340"/>
+          </w:tcPr>
+          <w:p>
+            <w:r/>
+            <w:r>
+              <w:rPr/>
+              <w:t>PO</w:t>
+            </w:r>
+          </w:p>
+        </w:tc>
+        <w:tc>
+          <w:tcPr>
+            <w:tcW w:type="dxa" w:w="2340"/>
+          </w:tcPr>
+          <w:p>
+            <w:r/>
+            <w:r>
+              <w:rPr/>
+              <w:t>BID</w:t>
+            </w:r>
+          </w:p>
+        </w:tc>
+      </w:tr>
+      <w:tr>
+        <w:tc>
+          <w:tcPr>
+            <w:tcW w:type="dxa" w:w="2340"/>
+          </w:tcPr>
+          <w:p>
+            <w:r/>
+            <w:r>
+              <w:rPr/>
+              <w:t>Atorvastatin</w:t>
+            </w:r>
+          </w:p>
+        </w:tc>
+        <w:tc>
+          <w:tcPr>
+            <w:tcW w:type="dxa" w:w="2340"/>
+          </w:tcPr>
+          <w:p>
+            <w:r/>
+            <w:r>
+              <w:rPr/>
+              <w:t>20 mg</w:t>
+            </w:r>
+          </w:p>
+        </w:tc>
+        <w:tc>
+          <w:tcPr>
+            <w:tcW w:type="dxa" w:w="2340"/>
+          </w:tcPr>
+          <w:p>
+            <w:r/>
+            <w:r>
+              <w:rPr/>
+              <w:t>PO</w:t>
+            </w:r>
+          </w:p>
+        </w:tc>
+        <w:tc>
+          <w:tcPr>
+            <w:tcW w:type="dxa" w:w="2340"/>
+          </w:tcPr>
+          <w:p>
+            <w:r/>
+            <w:r>
+              <w:rPr/>
+              <w:t>Daily at bedtime</w:t>
+            </w:r>
+          </w:p>
+        </w:tc>
+      </w:tr>
+      <w:tr>
+        <w:tc>
+          <w:tcPr>
+            <w:tcW w:type="dxa" w:w="2340"/>
+          </w:tcPr>
+          <w:p>
+            <w:r/>
+            <w:r>
+              <w:rPr/>
+              <w:t>Omeprazole</w:t>
+            </w:r>
+          </w:p>
+        </w:tc>
+        <w:tc>
+          <w:tcPr>
+            <w:tcW w:type="dxa" w:w="2340"/>
+          </w:tcPr>
+          <w:p>
+            <w:r/>
+            <w:r>
+              <w:rPr/>
+              <w:t>20 mg</w:t>
+            </w:r>
+          </w:p>
+        </w:tc>
+        <w:tc>
+          <w:tcPr>
+            <w:tcW w:type="dxa" w:w="2340"/>
+          </w:tcPr>
+          <w:p>
+            <w:r/>
+            <w:r>
+              <w:rPr/>
+              <w:t>PO</w:t>
+            </w:r>
+          </w:p>
+        </w:tc>
+        <w:tc>
+          <w:tcPr>
+            <w:tcW w:type="dxa" w:w="2340"/>
+          </w:tcPr>
+          <w:p>
+            <w:r/>
+            <w:r>
+              <w:rPr/>
+              <w:t>Daily</w:t>
+            </w:r>
+          </w:p>
+        </w:tc>
+      </w:tr>
+    </w:tbl>
+    <w:p>
+      <w:r>
+        <w:rPr>
+          <w:b/>
+        </w:rPr>
+        <w:t>Allergies:</w:t>
+      </w:r>
+    </w:p>
+    <w:p>
+      <w:pPr>
+        <w:pStyle w:val="ListBullet"/>
+      </w:pPr>
+      <w:r>
+        <w:rPr/>
+        <w:t>Penicillin (Anaphylaxis)</w:t>
+      </w:r>
+    </w:p>
+    <w:p>
+      <w:pPr>
+        <w:pStyle w:val="ListBullet"/>
+      </w:pPr>
+      <w:r>
+        <w:rPr/>
+        <w:t>Sulfa drugs (Hives)</w:t>
+      </w:r>
+    </w:p>
+    <w:p>
+      <w:pPr>
+        <w:pStyle w:val="Heading2"/>
+      </w:pPr>
+      <w:r>
+        <w:rPr>
+          <w:color w:val="1F3A5F"/>
+        </w:rPr>
+        <w:t>Reconciled MAR</w:t>
+      </w:r>
+    </w:p>
+    <w:tbl>
+      <w:tblPr>
+        <w:tblW w:type="dxa" w:w="9360"/>
+        <w:tblLayout w:type="fixed"/>
+        <w:tblLook w:firstColumn="1" w:firstRow="1" w:lastColumn="0" w:lastRow="0" w:noHBand="0" w:noVBand="1" w:val="04A0"/>
+      </w:tblPr>
+      <w:tblGrid>
+        <w:gridCol w:w="3120"/>
+        <w:gridCol w:w="3120"/>
+        <w:gridCol w:w="3120"/>
+      </w:tblGrid>
+      <w:tr>
+        <w:tc>
+          <w:tcPr>
+            <w:tcW w:type="dxa" w:w="3120"/>
+            <w:tcBorders>
+              <w:top w:val="single" w:sz="6" w:space="0" w:color="D0D7DE"/>
+              <w:left w:val="single" w:sz="6" w:space="0" w:color="D0D7DE"/>
+              <w:bottom w:val="single" w:sz="6" w:space="0" w:color="D0D7DE"/>
+              <w:right w:val="single" w:sz="6" w:space="0" w:color="D0D7DE"/>
+            </w:tcBorders>
+            <w:shd w:val="clear" w:color="auto" w:fill="F0F4F8"/>
+            <w:tcMar>
+              <w:top w:w="120" w:type="dxa"/>
+              <w:left w:w="120" w:type="dxa"/>
+              <w:bottom w:w="120" w:type="dxa"/>
+              <w:right w:w="120" w:type="dxa"/>
+            </w:tcMar>
+          </w:tcPr>
+          <w:p>
+            <w:pPr>
+              <w:jc w:val="left"/>
+            </w:pPr>
+            <w:r/>
+            <w:r>
+              <w:rPr>
+                <w:b/>
+              </w:rPr>
+              <w:t>Medication</w:t>
+            </w:r>
+          </w:p>
+        </w:tc>
+        <w:tc>
+          <w:tcPr>
+            <w:tcW w:type="dxa" w:w="3120"/>
+            <w:tcBorders>
+              <w:top w:val="single" w:sz="6" w:space="0" w:color="D0D7DE"/>
+              <w:left w:val="single" w:sz="6" w:space="0" w:color="D0D7DE"/>
+              <w:bottom w:val="single" w:sz="6" w:space="0" w:color="D0D7DE"/>
+              <w:right w:val="single" w:sz="6" w:space="0" w:color="D0D7DE"/>
+            </w:tcBorders>
+            <w:shd w:val="clear" w:color="auto" w:fill="F0F4F8"/>
+            <w:tcMar>
+              <w:top w:w="120" w:type="dxa"/>
+              <w:left w:w="120" w:type="dxa"/>
+              <w:bottom w:w="120" w:type="dxa"/>
+              <w:right w:w="120" w:type="dxa"/>
+            </w:tcMar>
+          </w:tcPr>
+          <w:p>
+            <w:pPr>
+              <w:jc w:val="left"/>
+            </w:pPr>
+            <w:r/>
+            <w:r>
+              <w:rPr>
+                <w:b/>
+              </w:rPr>
+              <w:t>Dose/Route</w:t>
+            </w:r>
+          </w:p>
+        </w:tc>
+        <w:tc>
+          <w:tcPr>
+            <w:tcW w:type="dxa" w:w="3120"/>
+            <w:tcBorders>
+              <w:top w:val="single" w:sz="6" w:space="0" w:color="D0D7DE"/>
+              <w:left w:val="single" w:sz="6" w:space="0" w:color="D0D7DE"/>
+              <w:bottom w:val="single" w:sz="6" w:space="0" w:color="D0D7DE"/>
+              <w:right w:val="single" w:sz="6" w:space="0" w:color="D0D7DE"/>
+            </w:tcBorders>
+            <w:shd w:val="clear" w:color="auto" w:fill="F0F4F8"/>
+            <w:tcMar>
+              <w:top w:w="120" w:type="dxa"/>
+              <w:left w:w="120" w:type="dxa"/>
+              <w:bottom w:w="120" w:type="dxa"/>
+              <w:right w:w="120" w:type="dxa"/>
+            </w:tcMar>
+          </w:tcPr>
+          <w:p>
+            <w:pPr>
+              <w:jc w:val="left"/>
+            </w:pPr>
+            <w:r/>
+            <w:r>
+              <w:rPr>
+                <w:b/>
+              </w:rPr>
+              <w:t>Frequency</w:t>
+            </w:r>
+          </w:p>
+        </w:tc>
+      </w:tr>
+      <w:tr>
+        <w:tc>
+          <w:tcPr>
+            <w:tcW w:type="dxa" w:w="3120"/>
+            <w:tcBorders>
+              <w:top w:val="single" w:sz="6" w:space="0" w:color="D0D7DE"/>
+              <w:left w:val="single" w:sz="6" w:space="0" w:color="D0D7DE"/>
+              <w:bottom w:val="single" w:sz="6" w:space="0" w:color="D0D7DE"/>
+              <w:right w:val="single" w:sz="6" w:space="0" w:color="D0D7DE"/>
+            </w:tcBorders>
+            <w:tcMar>
+              <w:top w:w="120" w:type="dxa"/>
+              <w:left w:w="120" w:type="dxa"/>
+              <w:bottom w:w="120" w:type="dxa"/>
+              <w:right w:w="120" w:type="dxa"/>
+            </w:tcMar>
+          </w:tcPr>
+          <w:p>
+            <w:r/>
+            <w:r>
+              <w:rPr/>
+              <w:t>Lisinopril</w:t>
+            </w:r>
+          </w:p>
+        </w:tc>
+        <w:tc>
+          <w:tcPr>
+            <w:tcW w:type="dxa" w:w="3120"/>
+            <w:tcBorders>
+              <w:top w:val="single" w:sz="6" w:space="0" w:color="D0D7DE"/>
+              <w:left w:val="single" w:sz="6" w:space="0" w:color="D0D7DE"/>
+              <w:bottom w:val="single" w:sz="6" w:space="0" w:color="D0D7DE"/>
+              <w:right w:val="single" w:sz="6" w:space="0" w:color="D0D7DE"/>
+            </w:tcBorders>
+            <w:tcMar>
+              <w:top w:w="120" w:type="dxa"/>
+              <w:left w:w="120" w:type="dxa"/>
+              <w:bottom w:w="120" w:type="dxa"/>
+              <w:right w:w="120" w:type="dxa"/>
+            </w:tcMar>
+          </w:tcPr>
+          <w:p>
+            <w:r/>
+            <w:r>
+              <w:rPr/>
+              <w:t>10 mg PO</w:t>
+            </w:r>
+          </w:p>
+        </w:tc>
+        <w:tc>
+          <w:tcPr>
+            <w:tcW w:type="dxa" w:w="3120"/>
+            <w:tcBorders>
+              <w:top w:val="single" w:sz="6" w:space="0" w:color="D0D7DE"/>
+              <w:left w:val="single" w:sz="6" w:space="0" w:color="D0D7DE"/>
+              <w:bottom w:val="single" w:sz="6" w:space="0" w:color="D0D7DE"/>
+              <w:right w:val="single" w:sz="6" w:space="0" w:color="D0D7DE"/>
+            </w:tcBorders>
+            <w:tcMar>
+              <w:top w:w="120" w:type="dxa"/>
+              <w:left w:w="120" w:type="dxa"/>
+              <w:bottom w:w="120" w:type="dxa"/>
+              <w:right w:w="120" w:type="dxa"/>
+            </w:tcMar>
+          </w:tcPr>
+          <w:p>
+            <w:r/>
+            <w:r>
+              <w:rPr/>
+              <w:t>Daily</w:t>
+            </w:r>
+          </w:p>
+        </w:tc>
+      </w:tr>
+      <w:tr>
+        <w:tc>
+          <w:tcPr>
+            <w:tcW w:type="dxa" w:w="3120"/>
+            <w:tcBorders>
+              <w:top w:val="single" w:sz="6" w:space="0" w:color="D0D7DE"/>
+              <w:left w:val="single" w:sz="6" w:space="0" w:color="D0D7DE"/>
+              <w:bottom w:val="single" w:sz="6" w:space="0" w:color="D0D7DE"/>
+              <w:right w:val="single" w:sz="6" w:space="0" w:color="D0D7DE"/>
+            </w:tcBorders>
+            <w:tcMar>
+              <w:top w:w="120" w:type="dxa"/>
+              <w:left w:w="120" w:type="dxa"/>
+              <w:bottom w:w="120" w:type="dxa"/>
+              <w:right w:w="120" w:type="dxa"/>
+            </w:tcMar>
+          </w:tcPr>
+          <w:p>
+            <w:r/>
+            <w:r>
+              <w:rPr/>
+              <w:t>Metformin</w:t>
+            </w:r>
+          </w:p>
+        </w:tc>
+        <w:tc>
+          <w:tcPr>
+            <w:tcW w:type="dxa" w:w="3120"/>
+            <w:tcBorders>
+              <w:top w:val="single" w:sz="6" w:space="0" w:color="D0D7DE"/>
+              <w:left w:val="single" w:sz="6" w:space="0" w:color="D0D7DE"/>
+              <w:bottom w:val="single" w:sz="6" w:space="0" w:color="D0D7DE"/>
+              <w:right w:val="single" w:sz="6" w:space="0" w:color="D0D7DE"/>
+            </w:tcBorders>
+            <w:tcMar>
+              <w:top w:w="120" w:type="dxa"/>
+              <w:left w:w="120" w:type="dxa"/>
+              <w:bottom w:w="120" w:type="dxa"/>
+              <w:right w:w="120" w:type="dxa"/>
+            </w:tcMar>
+          </w:tcPr>
+          <w:p>
+            <w:r/>
+            <w:r>
+              <w:rPr/>
+              <w:t>500 mg PO</w:t>
+            </w:r>
+          </w:p>
+        </w:tc>
+        <w:tc>
+          <w:tcPr>
+            <w:tcW w:type="dxa" w:w="3120"/>
+            <w:tcBorders>
+              <w:top w:val="single" w:sz="6" w:space="0" w:color="D0D7DE"/>
+              <w:left w:val="single" w:sz="6" w:space="0" w:color="D0D7DE"/>
+              <w:bottom w:val="single" w:sz="6" w:space="0" w:color="D0D7DE"/>
+              <w:right w:val="single" w:sz="6" w:space="0" w:color="D0D7DE"/>
+            </w:tcBorders>
+            <w:tcMar>
+              <w:top w:w="120" w:type="dxa"/>
+              <w:left w:w="120" w:type="dxa"/>
+              <w:bottom w:w="120" w:type="dxa"/>
+              <w:right w:w="120" w:type="dxa"/>
+            </w:tcMar>
+          </w:tcPr>
+          <w:p>
+            <w:r/>
+            <w:r>
+              <w:rPr/>
+              <w:t>BID</w:t>
+            </w:r>
+          </w:p>
+        </w:tc>
+      </w:tr>
+      <w:tr>
+        <w:tc>
+          <w:tcPr>
+            <w:tcW w:type="dxa" w:w="3120"/>
+            <w:tcBorders>
+              <w:top w:val="single" w:sz="6" w:space="0" w:color="D0D7DE"/>
+              <w:left w:val="single" w:sz="6" w:space="0" w:color="D0D7DE"/>
+              <w:bottom w:val="single" w:sz="6" w:space="0" w:color="D0D7DE"/>
+              <w:right w:val="single" w:sz="6" w:space="0" w:color="D0D7DE"/>
+            </w:tcBorders>
+            <w:tcMar>
+              <w:top w:w="120" w:type="dxa"/>
+              <w:left w:w="120" w:type="dxa"/>
+              <w:bottom w:w="120" w:type="dxa"/>
+              <w:right w:w="120" w:type="dxa"/>
+            </w:tcMar>
+          </w:tcPr>
+          <w:p>
+            <w:r/>
+            <w:r>
+              <w:rPr/>
+              <w:t>Atorvastatin</w:t>
+            </w:r>
+          </w:p>
+        </w:tc>
+        <w:tc>
+          <w:tcPr>
+            <w:tcW w:type="dxa" w:w="3120"/>
+            <w:tcBorders>
+              <w:top w:val="single" w:sz="6" w:space="0" w:color="D0D7DE"/>
+              <w:left w:val="single" w:sz="6" w:space="0" w:color="D0D7DE"/>
+              <w:bottom w:val="single" w:sz="6" w:space="0" w:color="D0D7DE"/>
+              <w:right w:val="single" w:sz="6" w:space="0" w:color="D0D7DE"/>
+            </w:tcBorders>
+            <w:tcMar>
+              <w:top w:w="120" w:type="dxa"/>
+              <w:left w:w="120" w:type="dxa"/>
+              <w:bottom w:w="120" w:type="dxa"/>
+              <w:right w:w="120" w:type="dxa"/>
+            </w:tcMar>
+          </w:tcPr>
+          <w:p>
+            <w:r/>
+            <w:r>
+              <w:rPr/>
+              <w:t>20 mg PO</w:t>
+            </w:r>
+          </w:p>
+        </w:tc>
+        <w:tc>
+          <w:tcPr>
+            <w:tcW w:type="dxa" w:w="3120"/>
+            <w:tcBorders>
+              <w:top w:val="single" w:sz="6" w:space="0" w:color="D0D7DE"/>
+              <w:left w:val="single" w:sz="6" w:space="0" w:color="D0D7DE"/>
+              <w:bottom w:val="single" w:sz="6" w:space="0" w:color="D0D7DE"/>
+              <w:right w:val="single" w:sz="6" w:space="0" w:color="D0D7DE"/>
+            </w:tcBorders>
+            <w:tcMar>
+              <w:top w:w="120" w:type="dxa"/>
+              <w:left w:w="120" w:type="dxa"/>
+              <w:bottom w:w="120" w:type="dxa"/>
+              <w:right w:w="120" w:type="dxa"/>
+            </w:tcMar>
+          </w:tcPr>
+          <w:p>
+            <w:r/>
+            <w:r>
+              <w:rPr/>
+              <w:t>Daily at bedtime</w:t>
+            </w:r>
+          </w:p>
+        </w:tc>
+      </w:tr>
+      <w:tr>
+        <w:tc>
+          <w:tcPr>
+            <w:tcW w:type="dxa" w:w="3120"/>
+            <w:tcBorders>
+              <w:top w:val="single" w:sz="6" w:space="0" w:color="D0D7DE"/>
+              <w:left w:val="single" w:sz="6" w:space="0" w:color="D0D7DE"/>
+              <w:bottom w:val="single" w:sz="6" w:space="0" w:color="D0D7DE"/>
+              <w:right w:val="single" w:sz="6" w:space="0" w:color="D0D7DE"/>
+            </w:tcBorders>
+            <w:tcMar>
+              <w:top w:w="120" w:type="dxa"/>
+              <w:left w:w="120" w:type="dxa"/>
+              <w:bottom w:w="120" w:type="dxa"/>
+              <w:right w:w="120" w:type="dxa"/>
+            </w:tcMar>
+          </w:tcPr>
+          <w:p>
+            <w:r/>
+            <w:r>
+              <w:rPr/>
+              <w:t>Omeprazole</w:t>
+            </w:r>
+          </w:p>
+        </w:tc>
+        <w:tc>
+          <w:tcPr>
+            <w:tcW w:type="dxa" w:w="3120"/>
+            <w:tcBorders>
+              <w:top w:val="single" w:sz="6" w:space="0" w:color="D0D7DE"/>
+              <w:left w:val="single" w:sz="6" w:space="0" w:color="D0D7DE"/>
+              <w:bottom w:val="single" w:sz="6" w:space="0" w:color="D0D7DE"/>
+              <w:right w:val="single" w:sz="6" w:space="0" w:color="D0D7DE"/>
+            </w:tcBorders>
+            <w:tcMar>
+              <w:top w:w="120" w:type="dxa"/>
+              <w:left w:w="120" w:type="dxa"/>
+              <w:bottom w:w="120" w:type="dxa"/>
+              <w:right w:w="120" w:type="dxa"/>
+            </w:tcMar>
+          </w:tcPr>
+          <w:p>
+            <w:r/>
+            <w:r>
+              <w:rPr/>
+              <w:t>20 mg PO</w:t>
+            </w:r>
+          </w:p>
+        </w:tc>
+        <w:tc>
+          <w:tcPr>
+            <w:tcW w:type="dxa" w:w="3120"/>
+            <w:tcBorders>
+              <w:top w:val="single" w:sz="6" w:space="0" w:color="D0D7DE"/>
+              <w:left w:val="single" w:sz="6" w:space="0" w:color="D0D7DE"/>
+              <w:bottom w:val="single" w:sz="6" w:space="0" w:color="D0D7DE"/>
+              <w:right w:val="single" w:sz="6" w:space="0" w:color="D0D7DE"/>
+            </w:tcBorders>
+            <w:tcMar>
+              <w:top w:w="120" w:type="dxa"/>
+              <w:left w:w="120" w:type="dxa"/>
+              <w:bottom w:w="120" w:type="dxa"/>
+              <w:right w:w="120" w:type="dxa"/>
+            </w:tcMar>
+          </w:tcPr>
+          <w:p>
+            <w:r/>
+            <w:r>
+              <w:rPr/>
+              <w:t>Daily</w:t>
+            </w:r>
+          </w:p>
+        </w:tc>
+      </w:tr>
+    </w:tbl>
+    <w:p>
+      <w:pPr>
+        <w:spacing w:before="300"/>
+      </w:pPr>
+      <w:r>
+        <w:rPr>
+          <w:i/>
+          <w:color w:val="555555"/>
+          <w:sz w:val="21"/>
+        </w:rPr>
+        <w:t>Note: This document is for clinical transfer purposes only and requires verification by the attending physician. Not intended as medical advice.</w:t>
+      </w:r>
+    </w:p>
     <w:sectPr>
       <w:pgSz w:w="12240" w:h="15840"/>
       <w:pgMar w:top="1440" w:right="1440" w:bottom="1440" w:left="1440" w:header="720" w:footer="720" w:gutter="0"/>

</xml_diff>